<commit_message>
docs: insert section 4.4 and Fig.7 (LLM call & cost comparison)
</commit_message>
<xml_diff>
--- a/docs/商品评价的观点自动提取-课题报告-v2.docx
+++ b/docs/商品评价的观点自动提取-课题报告-v2.docx
@@ -1950,6 +1950,99 @@
     </w:p>
     <w:p>
       <w:pPr>
+        <w:spacing w:line="360" w:lineRule="auto"/>
+      </w:pPr>
+      <w:r>
+        <w:rPr>
+          <w:rFonts w:ascii="Times New Roman" w:hAnsi="Times New Roman" w:eastAsia="黑体"/>
+          <w:b/>
+          <w:sz w:val="28"/>
+        </w:rPr>
+        <w:t>4.4 大模型调用量与成本对比</w:t>
+      </w:r>
+    </w:p>
+    <w:p>
+      <w:pPr>
+        <w:spacing w:line="360" w:lineRule="auto"/>
+        <w:ind w:firstLine="480"/>
+      </w:pPr>
+      <w:r>
+        <w:rPr>
+          <w:rFonts w:ascii="Times New Roman" w:hAnsi="Times New Roman" w:eastAsia="宋体"/>
+          <w:b w:val="0"/>
+          <w:sz w:val="24"/>
+        </w:rPr>
+        <w:t>分层路由的核心价值在于把初步判断的计算由远程大模型转移到本地路由层。路由层由本课题自研的轻量模型承担，在本地以毫秒级推理完成对每条评论的可疑性判断，运行时不产生任何大模型接口调用；只有被判定为可疑的评论才会触发深挖层。为量化这一机制带来的收益，本课题在验证集418条评论上按统一口径核算大模型的调用量。若不设路由层而将全部评论送入深挖层，大模型需要调用418次；接入路线A的本地路由后，被判为可疑的评论为291条，调用次数降至291次，降幅为30.4%；接入路线B的本地路由后，可疑评论为304条，调用次数降至304次，降幅为27.3%。</w:t>
+      </w:r>
+    </w:p>
+    <w:p>
+      <w:pPr>
+        <w:spacing w:line="360" w:lineRule="auto"/>
+        <w:ind w:firstLine="480"/>
+      </w:pPr>
+      <w:r>
+        <w:rPr>
+          <w:rFonts w:ascii="Times New Roman" w:hAnsi="Times New Roman" w:eastAsia="宋体"/>
+          <w:b w:val="0"/>
+          <w:sz w:val="24"/>
+        </w:rPr>
+        <w:t>在成本方面，本课题以深挖层单次调用的实测token为统一口径。深挖层单次调用按首轮调用口径实测，平均消耗输入950.4token、输出293.4token。按DeepSeek flash模型的闲时定价（输入1元每百万token、输出4元每百万token，高峰时段为北京时间周一至周五9:00至12:00与14:00至17:59，其余时段均按半价计，本核算取闲时价），单次深挖调用成本约为0.0021元。据此，全部418条评论均执行深挖的基线总成本约为0.888元；接入路线A后总成本降至0.618元，减少约0.270元，降幅为30.4%；接入路线B后总成本降至0.646元，减少约0.242元，降幅为27.3%。分层路由在不增加大模型调用总量的前提下，随着可疑评论比例的下降直接削减了调用量及其对应的成本开销，路由层以本地毫秒级推理换掉了原本需要远程大模型完成的初步判断。</w:t>
+      </w:r>
+    </w:p>
+    <w:p>
+      <w:pPr>
+        <w:jc w:val="center"/>
+      </w:pPr>
+      <w:r>
+        <w:drawing>
+          <wp:inline xmlns:a="http://schemas.openxmlformats.org/drawingml/2006/main" xmlns:pic="http://schemas.openxmlformats.org/drawingml/2006/picture">
+            <wp:extent cx="5580000" cy="2835738"/>
+            <wp:docPr id="7" name="Picture 7"/>
+            <wp:cNvGraphicFramePr>
+              <a:graphicFrameLocks noChangeAspect="1"/>
+            </wp:cNvGraphicFramePr>
+            <a:graphic>
+              <a:graphicData uri="http://schemas.openxmlformats.org/drawingml/2006/picture">
+                <pic:pic>
+                  <pic:nvPicPr>
+                    <pic:cNvPr id="0" name="call_cost_comparison.png"/>
+                    <pic:cNvPicPr/>
+                  </pic:nvPicPr>
+                  <pic:blipFill>
+                    <a:blip r:embed="rId15"/>
+                    <a:stretch>
+                      <a:fillRect/>
+                    </a:stretch>
+                  </pic:blipFill>
+                  <pic:spPr>
+                    <a:xfrm>
+                      <a:off x="0" y="0"/>
+                      <a:ext cx="5580000" cy="2835738"/>
+                    </a:xfrm>
+                    <a:prstGeom prst="rect"/>
+                  </pic:spPr>
+                </pic:pic>
+              </a:graphicData>
+            </a:graphic>
+          </wp:inline>
+        </w:drawing>
+      </w:r>
+    </w:p>
+    <w:p>
+      <w:pPr>
+        <w:jc w:val="center"/>
+      </w:pPr>
+      <w:r>
+        <w:rPr>
+          <w:rFonts w:ascii="Times New Roman" w:hAnsi="Times New Roman" w:eastAsia="宋体"/>
+          <w:b w:val="0"/>
+          <w:sz w:val="21"/>
+        </w:rPr>
+        <w:t>图7 分层路由带来的大模型调用量与成本对比</w:t>
+      </w:r>
+    </w:p>
+    <w:p>
+      <w:pPr>
         <w:spacing w:before="320" w:after="160" w:line="360" w:lineRule="auto"/>
       </w:pPr>
       <w:r>

</xml_diff>